<commit_message>
Buch update und Monster Kompendium und Abenteuer 09
</commit_message>
<xml_diff>
--- a/docs/Buch Bayrische Nächte/Buch 2.docx
+++ b/docs/Buch Bayrische Nächte/Buch 2.docx
@@ -3,79 +3,531 @@
 <w:document xmlns:wpc="http://schemas.microsoft.com/office/word/2010/wordprocessingCanvas" xmlns:cx="http://schemas.microsoft.com/office/drawing/2014/chartex" xmlns:cx1="http://schemas.microsoft.com/office/drawing/2015/9/8/chartex" xmlns:cx2="http://schemas.microsoft.com/office/drawing/2015/10/21/chartex" xmlns:cx3="http://schemas.microsoft.com/office/drawing/2016/5/9/chartex" xmlns:cx4="http://schemas.microsoft.com/office/drawing/2016/5/10/chartex" xmlns:cx5="http://schemas.microsoft.com/office/drawing/2016/5/11/chartex" xmlns:cx6="http://schemas.microsoft.com/office/drawing/2016/5/12/chartex" xmlns:cx7="http://schemas.microsoft.com/office/drawing/2016/5/13/chartex" xmlns:cx8="http://schemas.microsoft.com/office/drawing/2016/5/14/chartex" xmlns:mc="http://schemas.openxmlformats.org/markup-compatibility/2006" xmlns:aink="http://schemas.microsoft.com/office/drawing/2016/ink" xmlns:am3d="http://schemas.microsoft.com/office/drawing/2017/model3d" xmlns:o="urn:schemas-microsoft-com:office:office" xmlns:oel="http://schemas.microsoft.com/office/2019/extlst" xmlns:r="http://schemas.openxmlformats.org/officeDocument/2006/relationships" xmlns:m="http://schemas.openxmlformats.org/officeDocument/2006/math" xmlns:v="urn:schemas-microsoft-com:vml" xmlns:wp14="http://schemas.microsoft.com/office/word/2010/wordprocessingDrawing" xmlns:wp="http://schemas.openxmlformats.org/drawingml/2006/wordprocessingDrawing" xmlns:w10="urn:schemas-microsoft-com:office:word" xmlns:w="http://schemas.openxmlformats.org/wordprocessingml/2006/main" xmlns:w14="http://schemas.microsoft.com/office/word/2010/wordml" xmlns:w15="http://schemas.microsoft.com/office/word/2012/wordml" xmlns:w16cex="http://schemas.microsoft.com/office/word/2018/wordml/cex" xmlns:w16cid="http://schemas.microsoft.com/office/word/2016/wordml/cid" xmlns:w16="http://schemas.microsoft.com/office/word/2018/wordml" xmlns:w16du="http://schemas.microsoft.com/office/word/2023/wordml/word16du" xmlns:w16sdtdh="http://schemas.microsoft.com/office/word/2020/wordml/sdtdatahash" xmlns:w16sdtfl="http://schemas.microsoft.com/office/word/2024/wordml/sdtformatlock" xmlns:w16se="http://schemas.microsoft.com/office/word/2015/wordml/symex" xmlns:wpg="http://schemas.microsoft.com/office/word/2010/wordprocessingGroup" xmlns:wpi="http://schemas.microsoft.com/office/word/2010/wordprocessingInk" xmlns:wne="http://schemas.microsoft.com/office/word/2006/wordml" xmlns:wps="http://schemas.microsoft.com/office/word/2010/wordprocessingShape" mc:Ignorable="w14 w15 w16se w16cid w16 w16cex w16sdtdh w16sdtfl w16du wp14">
   <w:body>
     <w:p>
-      <w:r>
+      <w:pPr>
+        <w:rPr>
+          <w:lang w:val="de-DE"/>
+        </w:rPr>
+      </w:pPr>
+      <w:r>
+        <w:rPr>
+          <w:lang w:val="de-DE"/>
+        </w:rPr>
         <w:t>Flashback im Prolog, Interlude und Epiloge mit Maximilian Lanzinger und Michael Reichelt als Hauptcharaktere. Maximilian wurde von Zeitgeistern besessen und wurde von Michael gerettet. Seit dem ist Maximilian ein Medium das Unterbewusst, und später bewusst, Leute beeinflussen kann.</w:t>
       </w:r>
     </w:p>
-    <w:p/>
-    <w:p>
-      <w:r>
+    <w:p>
+      <w:pPr>
+        <w:rPr>
+          <w:lang w:val="de-DE"/>
+        </w:rPr>
+      </w:pPr>
+    </w:p>
+    <w:p>
+      <w:pPr>
+        <w:rPr>
+          <w:lang w:val="de-DE"/>
+        </w:rPr>
+      </w:pPr>
+      <w:r>
+        <w:rPr>
+          <w:lang w:val="de-DE"/>
+        </w:rPr>
         <w:t>Ansonsten spielt das Buch rund um das Geisterhaus in Geistersprenger PnP</w:t>
       </w:r>
     </w:p>
-    <w:p/>
-    <w:p>
-      <w:r>
+    <w:p>
+      <w:pPr>
+        <w:rPr>
+          <w:lang w:val="de-DE"/>
+        </w:rPr>
+      </w:pPr>
+    </w:p>
+    <w:p>
+      <w:pPr>
+        <w:rPr>
+          <w:lang w:val="de-DE"/>
+        </w:rPr>
+      </w:pPr>
+      <w:r>
+        <w:rPr>
+          <w:lang w:val="de-DE"/>
+        </w:rPr>
         <w:t>Kapitel 1:</w:t>
       </w:r>
     </w:p>
     <w:p>
-      <w:r>
+      <w:pPr>
+        <w:rPr>
+          <w:lang w:val="de-DE"/>
+        </w:rPr>
+      </w:pPr>
+      <w:r>
+        <w:rPr>
+          <w:lang w:val="de-DE"/>
+        </w:rPr>
         <w:t xml:space="preserve">Friedrich kämpft sich durch die überbauten Bäche von München. Dabei rettet er Marina und Alexander von den Fängen </w:t>
       </w:r>
       <w:r>
+        <w:rPr>
+          <w:lang w:val="de-DE"/>
+        </w:rPr>
         <w:t>eines Basilisken.</w:t>
       </w:r>
     </w:p>
-    <w:p/>
-    <w:p>
-      <w:r>
+    <w:p>
+      <w:pPr>
+        <w:rPr>
+          <w:lang w:val="de-DE"/>
+        </w:rPr>
+      </w:pPr>
+    </w:p>
+    <w:p>
+      <w:pPr>
+        <w:rPr>
+          <w:lang w:val="de-DE"/>
+        </w:rPr>
+      </w:pPr>
+      <w:r>
+        <w:rPr>
+          <w:lang w:val="de-DE"/>
+        </w:rPr>
         <w:t>https://www.sueddeutsche.de/muenchen/muenchen-schoen-schaurig-1.3322914</w:t>
       </w:r>
     </w:p>
     <w:p>
-      <w:r>
+      <w:pPr>
+        <w:rPr>
+          <w:lang w:val="de-DE"/>
+        </w:rPr>
+      </w:pPr>
+      <w:r>
+        <w:rPr>
+          <w:lang w:val="de-DE"/>
+        </w:rPr>
         <w:t>Basilisk: Legende vom Spiegelbrunnen hinter dem Münchner Rathaus</w:t>
       </w:r>
     </w:p>
     <w:p>
-      <w:r>
+      <w:pPr>
+        <w:rPr>
+          <w:lang w:val="de-DE"/>
+        </w:rPr>
+      </w:pPr>
+      <w:r>
+        <w:rPr>
+          <w:lang w:val="de-DE"/>
+        </w:rPr>
         <w:t>Hausmädchen, welche aus dem Brunnen Wasser holen, sind auf mysteriöse Art und Weiße gestorben. Der Weg führt in die Tiefen des Brunnens, wo in den überbauten Ausläufern der Isar und der Kanalisation ein Basilisk haust. Schaut man diesem in die Augen, so stirbt man sofort. Man muss sich die Augen bedecken. Bringt man einen Spiegel, so kann man den Basilisken mit den eigenen Waffen schlagen. So die Legende, denn dieser Trick hat nicht funktioniert und brachte Alexander in Bedrängnis. Friedrich musste ihn und Marina mit der Dienstwaffe retten.</w:t>
       </w:r>
     </w:p>
-    <w:p/>
-    <w:p>
-      <w:r>
+    <w:p>
+      <w:pPr>
+        <w:rPr>
+          <w:lang w:val="de-DE"/>
+        </w:rPr>
+      </w:pPr>
+    </w:p>
+    <w:p>
+      <w:pPr>
+        <w:rPr>
+          <w:lang w:val="de-DE"/>
+        </w:rPr>
+      </w:pPr>
+      <w:r>
+        <w:rPr>
+          <w:lang w:val="de-DE"/>
+        </w:rPr>
         <w:t>Letzte Hexe von München:</w:t>
       </w:r>
     </w:p>
     <w:p>
-      <w:r>
+      <w:pPr>
+        <w:rPr>
+          <w:lang w:val="de-DE"/>
+        </w:rPr>
+      </w:pPr>
+      <w:r>
+        <w:rPr>
+          <w:lang w:val="de-DE"/>
+        </w:rPr>
         <w:t>Eine Frau wird der Hexerei bezichtigt. Ein hoher Beamter will sie so aus dem Weg haben, da sie Geheimnisse über ihn weiß. Sie wird im Falkenturm eingesperrt und kann dort per Hexerei entfliehen. Der Beamte beauftragt die Custodire die Hexe zu fangen. Sie wird von den Helden gesucht, doch bringt sie den Beamten um und kann später fliehen. Das Trio hat wenig Mitleid mit dem Beamten.</w:t>
       </w:r>
     </w:p>
-    <w:p/>
-    <w:p>
-      <w:r>
+    <w:p>
+      <w:pPr>
+        <w:rPr>
+          <w:lang w:val="de-DE"/>
+        </w:rPr>
+      </w:pPr>
+    </w:p>
+    <w:p>
+      <w:pPr>
+        <w:rPr>
+          <w:lang w:val="de-DE"/>
+        </w:rPr>
+      </w:pPr>
+      <w:r>
+        <w:rPr>
+          <w:lang w:val="de-DE"/>
+        </w:rPr>
         <w:t>Der Jungfernturm der Stadtmauer:</w:t>
       </w:r>
     </w:p>
     <w:p>
-      <w:r>
+      <w:pPr>
+        <w:rPr>
+          <w:lang w:val="de-DE"/>
+        </w:rPr>
+      </w:pPr>
+      <w:r>
+        <w:rPr>
+          <w:lang w:val="de-DE"/>
+        </w:rPr>
         <w:t>Früher wurden von den Stadträten immer wieder Frauen vergewaltigt und im Jungfernturm „entsorgt“. Jahre später, als die Stadtmauer schon kaum noch steht, nur noch Ruine, wird im gleichen Turm eine Frau vergewaltigt und getötet. Alle Geister, welche als verbannt galten, werden dabei wieder freigesetzt und sind wütender als zuvor. Die gesamte Kammer Münchens muss</w:t>
       </w:r>
       <w:r>
+        <w:rPr>
+          <w:lang w:val="de-DE"/>
+        </w:rPr>
         <w:t xml:space="preserve"> sich auf der Suche begeben und Morde durch die Geister verhindern. Diese haben es auf die Nachfahren der ehemaligen Vergewaltiger abgesehen, egal ob Mann oder </w:t>
       </w:r>
       <w:r>
+        <w:rPr>
+          <w:lang w:val="de-DE"/>
+        </w:rPr>
         <w:lastRenderedPageBreak/>
         <w:t>Frau. Die Helden kommen dem auf die Spur und können so den Geist der als letztes Getöteten Frau aufhalten. Marina nimmt dessen Seele als erste fremde Seele auf und der Spuk endet bald.</w:t>
       </w:r>
     </w:p>
+    <w:p>
+      <w:pPr>
+        <w:rPr>
+          <w:lang w:val="de-DE"/>
+        </w:rPr>
+      </w:pPr>
+    </w:p>
+    <w:p>
+      <w:pPr>
+        <w:rPr>
+          <w:lang w:val="de-DE"/>
+        </w:rPr>
+      </w:pPr>
+    </w:p>
+    <w:p>
+      <w:pPr>
+        <w:rPr>
+          <w:lang w:val="de-DE"/>
+        </w:rPr>
+      </w:pPr>
+    </w:p>
+    <w:p>
+      <w:pPr>
+        <w:rPr>
+          <w:lang w:val="de-DE"/>
+        </w:rPr>
+      </w:pPr>
+      <w:r>
+        <w:rPr>
+          <w:lang w:val="de-DE"/>
+        </w:rPr>
+        <w:t>Alexander nimmt die Seele der Frau aus dem Jungfernturm auf und die beiden werden Freunde.</w:t>
+      </w:r>
+    </w:p>
+    <w:p>
+      <w:pPr>
+        <w:rPr>
+          <w:lang w:val="de-DE"/>
+        </w:rPr>
+      </w:pPr>
+    </w:p>
+    <w:p>
+      <w:pPr>
+        <w:rPr>
+          <w:lang w:val="de-DE"/>
+        </w:rPr>
+      </w:pPr>
+      <w:r>
+        <w:rPr>
+          <w:lang w:val="de-DE"/>
+        </w:rPr>
+        <w:t>Das Trio wird gefangen genommen von Dämonen und die Seele des Jungfernturms bietet an sich opfern zu lassen. Alexander sagt, er will seine Seele opfern um due anderen zu retten, doch die Dämonen wissen von den Tricks, sie denken, dass er wirklich s8eine eigene Seele opfert, da „gewaltsam“ aufgenommene Seele nicht zu einem gehören. Doch die Seele des Jungfernturms ist wahrlich eine Seele von Alexander und kann geopfert werden. Das Trio wird so befreit und bezwingt die Dämonen, leider wurde die Seele aus dem Jungfernturm dabei zerstört.</w:t>
+      </w:r>
+    </w:p>
+    <w:p>
+      <w:pPr>
+        <w:rPr>
+          <w:lang w:val="de-DE"/>
+        </w:rPr>
+      </w:pPr>
+    </w:p>
+    <w:p>
+      <w:r>
+        <w:rPr>
+          <w:lang w:val="de-DE"/>
+        </w:rPr>
+        <w:tab/>
+      </w:r>
+      <w:r>
+        <w:t>After their abduction and the subsequent destruction of the first soul he had carried Alexander had hid inside his room for three days straight. He had thought to let this one poor soul escape their so far eternal torment, to let them roam with him outside of their cage made of bricks and wood. But what had she done, rescuing him and the others, the cost her own life. And he was suffering for it.</w:t>
+      </w:r>
+      <w:r>
+        <w:t xml:space="preserve"> How he again was powerless to stop the cruelty. How he was part of the killing the man he had admired so much, the Count Alois Großberg, that had helped him to achieve something for himself, even if he was not sure if he could even do one thing right. He had persuaded his Professor to take a huge part in the project to build the cable car up the mountain at Lenggries. For he saw what Alexander could do.</w:t>
+      </w:r>
+    </w:p>
     <w:p/>
+    <w:p>
+      <w:r>
+        <w:t>His tears had dried some while ago, a faint crust of salt clinging to his cheeks. He had no one told about what he had endured, only kept it to himself. Had never spoken about the death of his brother, not to the police or even his grandparents. One time he had heard them talk about that matter, how they thought that it had been his fault, else he would have spoken to them, even just a few words. That had crushed him and he had locked himself away further and further.</w:t>
+      </w:r>
+      <w:r>
+        <w:t xml:space="preserve"> Told no one about how he was bullied at school, how he had been forgotten at his own graduation ceremony.</w:t>
+      </w:r>
+      <w:r>
+        <w:t xml:space="preserve"> </w:t>
+      </w:r>
+      <w:r>
+        <w:t xml:space="preserve">How he had slogged through mounts of books just to get accepted to university, no connections helping him but only hindering. </w:t>
+      </w:r>
+      <w:r>
+        <w:t>Though, in comparison to her he had endured nothing at all.</w:t>
+      </w:r>
+      <w:r>
+        <w:t xml:space="preserve"> So, should he be happy about what has happened to him so far? That it could be so much worse?</w:t>
+      </w:r>
+    </w:p>
+    <w:p>
+      <w:r>
+        <w:lastRenderedPageBreak/>
+        <w:tab/>
+        <w:t>He had evaluated his own life since he turned the key in the lock of his door, how he had been so useless not to have seen the Cult coming, the trap they had set. And how he had been so weak still to not stop them.</w:t>
+      </w:r>
+      <w:r>
+        <w:t xml:space="preserve"> He tried to think of something Alois could have said, something nice and warm, but he could not.</w:t>
+      </w:r>
+      <w:r>
+        <w:t xml:space="preserve"> Then twelve minutes ago he had come to the words of the person he </w:t>
+      </w:r>
+      <w:r>
+        <w:t>somewhat despised until now</w:t>
+      </w:r>
+      <w:r>
+        <w:t>. And how had he landed there? Thinking about suicide.</w:t>
+      </w:r>
+      <w:r>
+        <w:t xml:space="preserve"> For he had done so much wrong.</w:t>
+      </w:r>
+    </w:p>
+    <w:p>
+      <w:r>
+        <w:tab/>
+        <w:t>“I would have jumped of the highest church tower in Munich already, if I would not love myself as much as I did. Not my life, but me.</w:t>
+      </w:r>
+      <w:r>
+        <w:t xml:space="preserve"> Not what I did, but what I still can do.</w:t>
+      </w:r>
+      <w:r>
+        <w:t>”</w:t>
+      </w:r>
+    </w:p>
+    <w:p>
+      <w:r>
+        <w:tab/>
+        <w:t>That were the words of Michael Reichelt, the man that always smiled, come hell or death.</w:t>
+      </w:r>
+      <w:r>
+        <w:t xml:space="preserve"> And this man had confessed to them that he had basically killed his wife. And he still went on and on. Could he do the same? He thought about what Michael had said, </w:t>
+      </w:r>
+      <w:r>
+        <w:t>weighed</w:t>
+      </w:r>
+      <w:r>
+        <w:t xml:space="preserve"> every word.</w:t>
+      </w:r>
+      <w:r>
+        <w:t xml:space="preserve"> Then it hit him. What he had always missed. What no one could guide you to. What you have to discover on your own.</w:t>
+      </w:r>
+    </w:p>
+    <w:p>
+      <w:r>
+        <w:t>“</w:t>
+      </w:r>
+      <w:r>
+        <w:t>Matter to yourself, care for yourself, admire yourself, love yourself! That is what is important. For if you don’t matter, you can you to others. If you don’t care for you, how can you for others. If you can’t admire yourself, how can you admire others. If you don’t love yourself, how can you lov</w:t>
+      </w:r>
+      <w:r>
+        <w:t>e</w:t>
+      </w:r>
+      <w:r>
+        <w:t>. If you don’t feel importance to yourself</w:t>
+      </w:r>
+      <w:r>
+        <w:t xml:space="preserve">, if you work yourself into the ground night and day to just achieve that little bit of progress for others. How will you be able to do that after you are powerless. </w:t>
+      </w:r>
+      <w:r>
+        <w:t>So,</w:t>
+      </w:r>
+      <w:r>
+        <w:t xml:space="preserve"> give yourself time and peace, do something that matters only to you, focus on your needs. </w:t>
+      </w:r>
+      <w:r>
+        <w:t>Then</w:t>
+      </w:r>
+      <w:r>
+        <w:t xml:space="preserve"> you can go back ten times as strong, then you can truly help. Help those that are not able to help themselves. Those that don’t know how. Those that don’t have time like you. That don’t have hope.</w:t>
+      </w:r>
+      <w:r>
+        <w:t xml:space="preserve"> That don’t have strength.</w:t>
+      </w:r>
+      <w:r>
+        <w:t xml:space="preserve"> Then you can give some of your own to them. </w:t>
+      </w:r>
+      <w:r>
+        <w:t xml:space="preserve">Give hope to them. </w:t>
+      </w:r>
+      <w:r>
+        <w:t>And you can only nurture hope when you have hope for yourself.</w:t>
+      </w:r>
+      <w:r>
+        <w:t xml:space="preserve"> </w:t>
+      </w:r>
+      <w:r>
+        <w:t>“</w:t>
+      </w:r>
+    </w:p>
+    <w:p>
+      <w:r>
+        <w:t xml:space="preserve">Feeling like he had just solved an impossible formula Alexander sprang up from the bed, and scribbled down his thoughts, just to let them escape to the world. To hell if someone would read them, those are just proof that he thought about them himself. That he, Alexander Doppler, was loving himself. That no one could take that from him, for he was the only one that could. And the only one that could give it in the same matter. He set the pen aside, it sliding down the edge of the desk, but no matter. He threw </w:t>
+      </w:r>
+      <w:r>
+        <w:t>his thin jacker over his shoulders and went outside into the cold, now a smile on his face, a contrast to the grimace that was still painted on him with tears and impressions of and unkept bed.</w:t>
+      </w:r>
+    </w:p>
+    <w:p>
+      <w:r>
+        <w:t xml:space="preserve">Alexander </w:t>
+      </w:r>
+      <w:r>
+        <w:t xml:space="preserve">then </w:t>
+      </w:r>
+      <w:r>
+        <w:t xml:space="preserve">went to the Jungfernturm, back to the place where the stories had told that there had been killed dozens of women. He went down the few steps into the shallow and sad down, sensing the presence of more than just the soul of her that they had found, that was haunting people so far that they had almost killed themselves. There he just listened to their wails, their hurt they had suffered in their last days on earth and the gruesome death they had been delt to. Ending up like these tormented souls. He did not react to them in </w:t>
+      </w:r>
+      <w:r>
+        <w:lastRenderedPageBreak/>
+        <w:t xml:space="preserve">anger, nor did he cry or flee. He just listened. </w:t>
+      </w:r>
+      <w:r>
+        <w:t>They</w:t>
+      </w:r>
+      <w:r>
+        <w:t xml:space="preserve"> slowly quieted down, their cries of pain and </w:t>
+      </w:r>
+      <w:r>
+        <w:t>torture replaced by soft tears of sorrow and neglect.</w:t>
+      </w:r>
+    </w:p>
+    <w:p>
+      <w:r>
+        <w:t>They would not find a way out of this misery themselves, their mind gone long ago and souls filled to the brim with their last experiences on earth. That is why he would carry them away from this tower if they let him, listen to their stories hidden in the lines of their suffering. He knew he could carry himself now, so he would do the same for someone else. One after the other they found a new home within is own soul, an open ground for them to rest. So long until they would be ready to go on themselves, find their way to the afterlife they should have been a part of.</w:t>
+      </w:r>
+      <w:r>
+        <w:t xml:space="preserve"> A stream of white contours gathered around him, smoke he could faintly see. In the end seven of them chose to stay with him, other too hard to see, their souls gone too far, their pain too great, their life to far away. But he was able to help these seven.</w:t>
+      </w:r>
+      <w:r>
+        <w:t xml:space="preserve"> </w:t>
+      </w:r>
+      <w:r>
+        <w:t>And he would never ask a thing of them.</w:t>
+      </w:r>
+    </w:p>
     <w:p/>
-    <w:p/>
-    <w:p/>
+    <w:p>
+      <w:pPr>
+        <w:rPr>
+          <w:lang w:val="de-DE"/>
+        </w:rPr>
+      </w:pPr>
+      <w:r>
+        <w:rPr>
+          <w:lang w:val="de-DE"/>
+        </w:rPr>
+        <w:t xml:space="preserve">Die Helden werden in ein Haus eingeladen, wo für sie unwissend ein geist haust. Dieser will Rache an ihnen ausüben, da sie den Vampir getötet haben. Diese können sich jedoch lange genug wehren, um das Haus anzuzünden und den Geist mit dem Haus auszulöschen. </w:t>
+      </w:r>
+      <w:r>
+        <w:rPr>
+          <w:lang w:val="de-DE"/>
+        </w:rPr>
+        <w:t>Während</w:t>
+      </w:r>
+      <w:r>
+        <w:rPr>
+          <w:lang w:val="de-DE"/>
+        </w:rPr>
+        <w:t xml:space="preserve"> sie </w:t>
+      </w:r>
+      <w:r>
+        <w:rPr>
+          <w:lang w:val="de-DE"/>
+        </w:rPr>
+        <w:t>kämpfen</w:t>
+      </w:r>
+      <w:r>
+        <w:rPr>
+          <w:lang w:val="de-DE"/>
+        </w:rPr>
+        <w:t xml:space="preserve"> und fliehen spielt auf einem </w:t>
+      </w:r>
+      <w:r>
+        <w:rPr>
+          <w:lang w:val="de-DE"/>
+        </w:rPr>
+        <w:t>Grammophon</w:t>
+      </w:r>
+      <w:r>
+        <w:rPr>
+          <w:lang w:val="de-DE"/>
+        </w:rPr>
+        <w:t xml:space="preserve"> eine musikalische Nummer passend zur </w:t>
+      </w:r>
+      <w:r>
+        <w:rPr>
+          <w:lang w:val="de-DE"/>
+        </w:rPr>
+        <w:t>rasanten</w:t>
+      </w:r>
+      <w:r>
+        <w:rPr>
+          <w:lang w:val="de-DE"/>
+        </w:rPr>
+        <w:t xml:space="preserve"> Flucht.</w:t>
+      </w:r>
+    </w:p>
+    <w:p>
+      <w:pPr>
+        <w:rPr>
+          <w:lang w:val="de-DE"/>
+        </w:rPr>
+      </w:pPr>
+      <w:r>
+        <w:rPr>
+          <w:lang w:val="de-DE"/>
+        </w:rPr>
+        <w:t>Sidestory:</w:t>
+      </w:r>
+    </w:p>
+    <w:p>
+      <w:pPr>
+        <w:rPr>
+          <w:lang w:val="de-DE"/>
+        </w:rPr>
+      </w:pPr>
+      <w:r>
+        <w:rPr>
+          <w:lang w:val="de-DE"/>
+        </w:rPr>
+        <w:t>Taa Vo wird als ehrenwerter Dämon Gast einer Familie und lernt wie es ist ein Mensch zu sein. Die Tochter der Familie hat Kaninchen und er lernt den vorsichtigen Umgang mit diesen. Am Ende wird er von anderen Dämonen besucht und lernt über deren Pläne.</w:t>
+      </w:r>
+    </w:p>
     <w:sectPr>
       <w:pgSz w:w="11906" w:h="16838"/>
       <w:pgMar w:top="1417" w:right="1417" w:bottom="1134" w:left="1417" w:header="708" w:footer="708" w:gutter="0"/>
@@ -486,6 +938,9 @@
   <w:style w:type="paragraph" w:default="1" w:styleId="Standard">
     <w:name w:val="Normal"/>
     <w:qFormat/>
+    <w:rPr>
+      <w:lang w:val="en-US"/>
+    </w:rPr>
   </w:style>
   <w:style w:type="paragraph" w:styleId="berschrift1">
     <w:name w:val="heading 1"/>

</xml_diff>

<commit_message>
Buch und Story 10
</commit_message>
<xml_diff>
--- a/docs/Buch Bayrische Nächte/Buch 2.docx
+++ b/docs/Buch Bayrische Nächte/Buch 2.docx
@@ -65,7 +65,31 @@
         <w:rPr>
           <w:lang w:val="de-DE"/>
         </w:rPr>
-        <w:t xml:space="preserve">Friedrich kämpft sich durch die überbauten Bäche von München. Dabei rettet er Marina und Alexander von den Fängen </w:t>
+        <w:t xml:space="preserve">Friedrich kämpft sich durch die überbauten Bäche von München. </w:t>
+      </w:r>
+      <w:r>
+        <w:rPr>
+          <w:lang w:val="de-DE"/>
+        </w:rPr>
+        <w:t xml:space="preserve">Er selbst wird fast gefressen, als Wilhelm ihn rettet. Sie haben ihn auf dessen erste Mission mitgenommen und er zeigt wie wichtig Kampferfahrung und Training ist. </w:t>
+      </w:r>
+      <w:r>
+        <w:rPr>
+          <w:lang w:val="de-DE"/>
+        </w:rPr>
+        <w:t xml:space="preserve">Dabei rettet er </w:t>
+      </w:r>
+      <w:r>
+        <w:rPr>
+          <w:lang w:val="de-DE"/>
+        </w:rPr>
+        <w:t xml:space="preserve">auch </w:t>
+      </w:r>
+      <w:r>
+        <w:rPr>
+          <w:lang w:val="de-DE"/>
+        </w:rPr>
+        <w:t xml:space="preserve">Marina und Alexander von den Fängen </w:t>
       </w:r>
       <w:r>
         <w:rPr>
@@ -73,6 +97,12 @@
         </w:rPr>
         <w:t>eines Basilisken.</w:t>
       </w:r>
+      <w:r>
+        <w:rPr>
+          <w:lang w:val="de-DE"/>
+        </w:rPr>
+        <w:t xml:space="preserve"> Alexander und Friedrich stemmen sich noch etwas gegen das Training, so wie sie es früher taten. Doch geben sie bald nach und lassen sich weiter in Waffen einweisen.</w:t>
+      </w:r>
     </w:p>
     <w:p>
       <w:pPr>
@@ -183,28 +213,74 @@
         <w:rPr>
           <w:lang w:val="de-DE"/>
         </w:rPr>
-        <w:t>Früher wurden von den Stadträten immer wieder Frauen vergewaltigt und im Jungfernturm „entsorgt“. Jahre später, als die Stadtmauer schon kaum noch steht, nur noch Ruine, wird im gleichen Turm eine Frau vergewaltigt und getötet. Alle Geister, welche als verbannt galten, werden dabei wieder freigesetzt und sind wütender als zuvor. Die gesamte Kammer Münchens muss</w:t>
-      </w:r>
-      <w:r>
-        <w:rPr>
-          <w:lang w:val="de-DE"/>
-        </w:rPr>
-        <w:t xml:space="preserve"> sich auf der Suche begeben und Morde durch die Geister verhindern. Diese haben es auf die Nachfahren der ehemaligen Vergewaltiger abgesehen, egal ob Mann oder </w:t>
+        <w:t xml:space="preserve">Früher wurden von den Stadträten immer wieder Frauen vergewaltigt und im Jungfernturm „entsorgt“. Jahre später, als die Stadtmauer schon kaum noch steht, nur noch Ruine, wird im </w:t>
       </w:r>
       <w:r>
         <w:rPr>
           <w:lang w:val="de-DE"/>
         </w:rPr>
         <w:lastRenderedPageBreak/>
-        <w:t>Frau. Die Helden kommen dem auf die Spur und können so den Geist der als letztes Getöteten Frau aufhalten. Marina nimmt dessen Seele als erste fremde Seele auf und der Spuk endet bald.</w:t>
-      </w:r>
-    </w:p>
-    <w:p>
-      <w:pPr>
-        <w:rPr>
-          <w:lang w:val="de-DE"/>
-        </w:rPr>
-      </w:pPr>
+        <w:t>gleichen Turm eine Frau vergewaltigt und getötet. Alle Geister, welche als verbannt galten, werden dabei wieder freigesetzt und sind wütender als zuvor. Die gesamte Kammer Münchens muss</w:t>
+      </w:r>
+      <w:r>
+        <w:rPr>
+          <w:lang w:val="de-DE"/>
+        </w:rPr>
+        <w:t xml:space="preserve"> sich auf der Suche begeben und Morde durch die Geister verhindern. Diese haben es auf die Nachfahren der ehemaligen Vergewaltiger abgesehen, egal ob Mann oder Frau. Die Helden kommen dem auf die Spur und können so den Geist der als letztes Getöteten Frau aufhalten. Marina nimmt dessen Seele als erste fremde Seele auf und der Spuk endet bald.</w:t>
+      </w:r>
+    </w:p>
+    <w:p>
+      <w:pPr>
+        <w:rPr>
+          <w:lang w:val="de-DE"/>
+        </w:rPr>
+      </w:pPr>
+    </w:p>
+    <w:p>
+      <w:pPr>
+        <w:rPr>
+          <w:lang w:val="de-DE"/>
+        </w:rPr>
+      </w:pPr>
+      <w:r>
+        <w:rPr>
+          <w:lang w:val="de-DE"/>
+        </w:rPr>
+        <w:t>Anna wird tiefer in das Wesen des Ur-Werwolfs hineingezogen. Sie wird brutaler und blutrünstiger. Und sie zweifelt an den Custodire, da man ihr in großer Zahl feindselig ist. Nur die Helden, welche ihren Vater ins Gefägniss gebracht habne, und eine kleien Zahl von Leuten rund um Helene Berthold halten zu ihr.</w:t>
+      </w:r>
+    </w:p>
+    <w:p>
+      <w:pPr>
+        <w:rPr>
+          <w:lang w:val="de-DE"/>
+        </w:rPr>
+      </w:pPr>
+    </w:p>
+    <w:p>
+      <w:pPr>
+        <w:rPr>
+          <w:lang w:val="de-DE"/>
+        </w:rPr>
+      </w:pPr>
+      <w:r>
+        <w:rPr>
+          <w:lang w:val="de-DE"/>
+        </w:rPr>
+        <w:t>Josef, August, und von Ingenheim übernehmen mehr und mehr Aufträge des kults. Josef ist neutral eingestellt, von INgeenheim möchte fliehen und August geht im Kult komplett auf unid wird wahrlich gläubig.</w:t>
+      </w:r>
+    </w:p>
+    <w:p>
+      <w:pPr>
+        <w:rPr>
+          <w:lang w:val="de-DE"/>
+        </w:rPr>
+      </w:pPr>
+      <w:r>
+        <w:rPr>
+          <w:lang w:val="de-DE"/>
+        </w:rPr>
+        <w:t>August wird darauf angesetzt die Wardens zu infiltrieren. Sie stellen einen Mosnterangriff nach, wobei er möglichst glubwürdig sich und andere rettet. Die Wardens nehmen wirklich jeden auf den sie kriegen können. Er tritt heimlich den Custodire bei, Anna ist stutzig.</w:t>
+      </w:r>
     </w:p>
     <w:p>
       <w:pPr>
@@ -268,7 +344,11 @@
         <w:tab/>
       </w:r>
       <w:r>
-        <w:t>After their abduction and the subsequent destruction of the first soul he had carried Alexander had hid inside his room for three days straight. He had thought to let this one poor soul escape their so far eternal torment, to let them roam with him outside of their cage made of bricks and wood. But what had she done, rescuing him and the others, the cost her own life. And he was suffering for it.</w:t>
+        <w:t xml:space="preserve">After their abduction and the subsequent destruction of the first soul he had carried Alexander had hid inside his room for three days straight. He had thought to let this one poor soul escape their so far eternal torment, to let them roam with him outside of their cage made of bricks and wood. But what had she done, rescuing him and the others, the cost her </w:t>
+      </w:r>
+      <w:r>
+        <w:lastRenderedPageBreak/>
+        <w:t>own life. And he was suffering for it.</w:t>
       </w:r>
       <w:r>
         <w:t xml:space="preserve"> How he again was powerless to stop the cruelty. How he was part of the killing the man he had admired so much, the Count Alois Großberg, that had helped him to achieve something for himself, even if he was not sure if he could even do one thing right. He had persuaded his Professor to take a huge part in the project to build the cable car up the mountain at Lenggries. For he saw what Alexander could do.</w:t>
@@ -277,27 +357,11 @@
     <w:p/>
     <w:p>
       <w:r>
-        <w:t>His tears had dried some while ago, a faint crust of salt clinging to his cheeks. He had no one told about what he had endured, only kept it to himself. Had never spoken about the death of his brother, not to the police or even his grandparents. One time he had heard them talk about that matter, how they thought that it had been his fault, else he would have spoken to them, even just a few words. That had crushed him and he had locked himself away further and further.</w:t>
-      </w:r>
-      <w:r>
-        <w:t xml:space="preserve"> Told no one about how he was bullied at school, how he had been forgotten at his own graduation ceremony.</w:t>
-      </w:r>
-      <w:r>
-        <w:t xml:space="preserve"> </w:t>
-      </w:r>
-      <w:r>
-        <w:t xml:space="preserve">How he had slogged through mounts of books just to get accepted to university, no connections helping him but only hindering. </w:t>
-      </w:r>
-      <w:r>
-        <w:t>Though, in comparison to her he had endured nothing at all.</w:t>
-      </w:r>
-      <w:r>
-        <w:t xml:space="preserve"> So, should he be happy about what has happened to him so far? That it could be so much worse?</w:t>
-      </w:r>
-    </w:p>
-    <w:p>
-      <w:r>
-        <w:lastRenderedPageBreak/>
+        <w:t>His tears had dried some while ago, a faint crust of salt clinging to his cheeks. He had no one told about what he had endured, only kept it to himself. Had never spoken about the death of his brother, not to the police or even his grandparents. One time he had heard them talk about that matter, how they thought that it had been his fault, else he would have spoken to them, even just a few words. That had crushed him and he had locked himself away further and further. Told no one about how he was bullied at school, how he had been forgotten at his own graduation ceremony. How he had slogged through mounts of books just to get accepted to university, no connections helping him but only hindering. Though, in comparison to her he had endured nothing at all. So, should he be happy about what has happened to him so far? That it could be so much worse?</w:t>
+      </w:r>
+    </w:p>
+    <w:p>
+      <w:r>
         <w:tab/>
         <w:t>He had evaluated his own life since he turned the key in the lock of his door, how he had been so useless not to have seen the Cult coming, the trap they had set. And how he had been so weak still to not stop them.</w:t>
       </w:r>
@@ -379,7 +443,11 @@
         <w:t xml:space="preserve"> That don’t have strength.</w:t>
       </w:r>
       <w:r>
-        <w:t xml:space="preserve"> Then you can give some of your own to them. </w:t>
+        <w:t xml:space="preserve"> Then </w:t>
+      </w:r>
+      <w:r>
+        <w:lastRenderedPageBreak/>
+        <w:t xml:space="preserve">you can give some of your own to them. </w:t>
       </w:r>
       <w:r>
         <w:t xml:space="preserve">Give hope to them. </w:t>
@@ -410,37 +478,72 @@
         <w:t xml:space="preserve">then </w:t>
       </w:r>
       <w:r>
-        <w:t xml:space="preserve">went to the Jungfernturm, back to the place where the stories had told that there had been killed dozens of women. He went down the few steps into the shallow and sad down, sensing the presence of more than just the soul of her that they had found, that was haunting people so far that they had almost killed themselves. There he just listened to their wails, their hurt they had suffered in their last days on earth and the gruesome death they had been delt to. Ending up like these tormented souls. He did not react to them in </w:t>
-      </w:r>
-      <w:r>
+        <w:t xml:space="preserve">went to the Jungfernturm, back to the place where the stories had told that there had been killed dozens of women. He went down the few steps into the shallow and sad down, sensing the presence of more than just the soul of her that they had found, that was haunting people so far that they had almost killed themselves. There he just listened to their wails, their hurt they had suffered in their last days on earth and the gruesome death they had been delt to. Ending up like these tormented souls. He did not react to them in anger, nor did he cry or flee. He just listened. </w:t>
+      </w:r>
+      <w:r>
+        <w:t>They</w:t>
+      </w:r>
+      <w:r>
+        <w:t xml:space="preserve"> slowly quieted down, their cries of pain and </w:t>
+      </w:r>
+      <w:r>
+        <w:t>torture replaced by soft tears of sorrow and neglect.</w:t>
+      </w:r>
+    </w:p>
+    <w:p>
+      <w:r>
+        <w:t>They would not find a way out of this misery themselves, their mind gone long ago and souls filled to the brim with their last experiences on earth. That is why he would carry them away from this tower if they let him, listen to their stories hidden in the lines of their suffering. He knew he could carry himself now, so he would do the same for someone else. One after the other they found a new home within is own soul, an open ground for them to rest. So long until they would be ready to go on themselves, find their way to the afterlife they should have been a part of.</w:t>
+      </w:r>
+      <w:r>
+        <w:t xml:space="preserve"> A stream of white contours gathered around him, smoke he could faintly see. In the end seven of them chose to stay with him, other too hard to see, their souls gone too far, their pain too great, their life to far away. But he was able to help these seven.</w:t>
+      </w:r>
+      <w:r>
+        <w:t xml:space="preserve"> </w:t>
+      </w:r>
+      <w:r>
+        <w:t>And he would never ask a thing of them.</w:t>
+      </w:r>
+    </w:p>
+    <w:p/>
+    <w:p>
+      <w:pPr>
+        <w:rPr>
+          <w:lang w:val="de-DE"/>
+        </w:rPr>
+      </w:pPr>
+      <w:r>
+        <w:rPr>
+          <w:lang w:val="de-DE"/>
+        </w:rPr>
+        <w:t>Wilhelm wird als nun Te</w:t>
+      </w:r>
+      <w:r>
+        <w:rPr>
+          <w:lang w:val="de-DE"/>
+        </w:rPr>
+        <w:t>il der Custodire zu einem Auftrag mitgenommen. Dort geht es gegen eine Plage von kleinere Goblinartigen wesen, welche immer wieder einzelne Menschen auf der Reise durch Wälder und Schluchten töten. Diese Wesen sind sehr gefährlich und es werden mehr waffenerfahrene Personen benötigt. Friedrich und Alexander tun das militärische Gehabe von Wilhelm ab, Friedrich da er das Militär hasst, Alexander, da er nicht sieht warum er auf konventionelle Art kämpfen muss. Marina hält zu ihrem Mann und er zeigt durch seine Taktik und können mit dem Säbel und Revolver, wie schnell und marzialisch er Mengen an Biestern töten kann. Die Helden werden nämlich von einer Meute an Wesen überrascht, doch Wilhelm kämpft sich hindurch und kann mit den anderen als Unterstützung den Anführer der Horde töten. Die überlebenden Wesen verteile sich in alle Winde.</w:t>
+      </w:r>
+      <w:r>
+        <w:rPr>
+          <w:lang w:val="de-DE"/>
+        </w:rPr>
+        <w:br/>
+      </w:r>
+      <w:r>
+        <w:rPr>
+          <w:lang w:val="de-DE"/>
+        </w:rPr>
         <w:lastRenderedPageBreak/>
-        <w:t xml:space="preserve">anger, nor did he cry or flee. He just listened. </w:t>
-      </w:r>
-      <w:r>
-        <w:t>They</w:t>
-      </w:r>
-      <w:r>
-        <w:t xml:space="preserve"> slowly quieted down, their cries of pain and </w:t>
-      </w:r>
-      <w:r>
-        <w:t>torture replaced by soft tears of sorrow and neglect.</w:t>
-      </w:r>
-    </w:p>
-    <w:p>
-      <w:r>
-        <w:t>They would not find a way out of this misery themselves, their mind gone long ago and souls filled to the brim with their last experiences on earth. That is why he would carry them away from this tower if they let him, listen to their stories hidden in the lines of their suffering. He knew he could carry himself now, so he would do the same for someone else. One after the other they found a new home within is own soul, an open ground for them to rest. So long until they would be ready to go on themselves, find their way to the afterlife they should have been a part of.</w:t>
-      </w:r>
-      <w:r>
-        <w:t xml:space="preserve"> A stream of white contours gathered around him, smoke he could faintly see. In the end seven of them chose to stay with him, other too hard to see, their souls gone too far, their pain too great, their life to far away. But he was able to help these seven.</w:t>
-      </w:r>
-      <w:r>
-        <w:t xml:space="preserve"> </w:t>
-      </w:r>
-      <w:r>
-        <w:t>And he would never ask a thing of them.</w:t>
-      </w:r>
-    </w:p>
-    <w:p/>
+        <w:t>Alexander sinniert über die den Umstand, dass diese Wesen eine Gemeinschaft waren und zum Denken fähig waren. Töten sie hier einfühlende Wesen?</w:t>
+      </w:r>
+    </w:p>
+    <w:p>
+      <w:pPr>
+        <w:rPr>
+          <w:lang w:val="de-DE"/>
+        </w:rPr>
+      </w:pPr>
+    </w:p>
     <w:p>
       <w:pPr>
         <w:rPr>

</xml_diff>

<commit_message>
Update Buch und Charakter Bios
</commit_message>
<xml_diff>
--- a/docs/Buch Bayrische Nächte/Buch 2.docx
+++ b/docs/Buch Bayrische Nächte/Buch 2.docx
@@ -12,21 +12,7 @@
         <w:rPr>
           <w:lang w:val="de-DE"/>
         </w:rPr>
-        <w:t xml:space="preserve">Flashback im Prolog, </w:t>
-      </w:r>
-      <w:proofErr w:type="spellStart"/>
-      <w:r>
-        <w:rPr>
-          <w:lang w:val="de-DE"/>
-        </w:rPr>
-        <w:t>Interlude</w:t>
-      </w:r>
-      <w:proofErr w:type="spellEnd"/>
-      <w:r>
-        <w:rPr>
-          <w:lang w:val="de-DE"/>
-        </w:rPr>
-        <w:t xml:space="preserve"> und Epiloge mit Maximilian Lanzinger und Michael Reichelt als Hauptcharaktere. Maximilian wurde von Zeitgeistern besessen und wurde von Michael gerettet. </w:t>
+        <w:t xml:space="preserve">Flashback im Prolog, Interlude und Epiloge mit Maximilian Lanzinger und Michael Reichelt als Hauptcharaktere. Maximilian wurde von Zeitgeistern besessen und wurde von Michael gerettet. </w:t>
       </w:r>
       <w:r>
         <w:rPr>
@@ -58,16 +44,8 @@
         <w:rPr>
           <w:lang w:val="de-DE"/>
         </w:rPr>
-        <w:t xml:space="preserve">Ansonsten spielt das Buch rund um das Geisterhaus in Geistersprenger </w:t>
-      </w:r>
-      <w:proofErr w:type="spellStart"/>
-      <w:r>
-        <w:rPr>
-          <w:lang w:val="de-DE"/>
-        </w:rPr>
-        <w:t>PnP</w:t>
-      </w:r>
-      <w:proofErr w:type="spellEnd"/>
+        <w:t>Ansonsten spielt das Buch rund um das Geisterhaus in Geistersprenger PnP</w:t>
+      </w:r>
     </w:p>
     <w:p>
       <w:pPr>
@@ -155,6 +133,78 @@
         <w:rPr>
           <w:lang w:val="de-DE"/>
         </w:rPr>
+        <w:t>Kapitel 2:</w:t>
+      </w:r>
+    </w:p>
+    <w:p>
+      <w:pPr>
+        <w:rPr>
+          <w:lang w:val="de-DE"/>
+        </w:rPr>
+      </w:pPr>
+      <w:r>
+        <w:rPr>
+          <w:lang w:val="de-DE"/>
+        </w:rPr>
+        <w:t>Die Helden gehen zu einer Versammlung der Wardens, dort geht es nicht nur um die bevorstehende große Sitzung auf der Wartburg, sondern auch um die ‚Veröffentlichung‘ der Sichtung des Ashbearers in Nürnberg. Das ist die sechste Sichtung in den Aufzeichnungen der Custodire, das gleiche Aufkommen wie die Schriften an der Decke von heiligen Stätten. Etwas großes ist im Gange, etwas von dem man noch wenig ahnt.</w:t>
+      </w:r>
+      <w:r>
+        <w:rPr>
+          <w:lang w:val="de-DE"/>
+        </w:rPr>
+        <w:t xml:space="preserve"> Alexander weiß, dass mit diesen Nummern die Zahlen in den Versen gemeint ist, es muss so sein. Doch wer soll ihm trauen.</w:t>
+      </w:r>
+    </w:p>
+    <w:p>
+      <w:pPr>
+        <w:rPr>
+          <w:lang w:val="de-DE"/>
+        </w:rPr>
+      </w:pPr>
+    </w:p>
+    <w:p>
+      <w:pPr>
+        <w:rPr>
+          <w:lang w:val="de-DE"/>
+        </w:rPr>
+      </w:pPr>
+      <w:r>
+        <w:rPr>
+          <w:lang w:val="de-DE"/>
+        </w:rPr>
+        <w:t>Kapitel 2:</w:t>
+      </w:r>
+    </w:p>
+    <w:p>
+      <w:pPr>
+        <w:rPr>
+          <w:lang w:val="de-DE"/>
+        </w:rPr>
+      </w:pPr>
+      <w:r>
+        <w:rPr>
+          <w:lang w:val="de-DE"/>
+        </w:rPr>
+        <w:t>Alexander nimmt teil an der Obduktion des Ashbearers als Zuschauer. Man endeckt die Besonderheiten rund um deren Markierungen und das Blut. Eine Seele kann den Körper des Ashbearers kaum  berühren ohne davon wie ein Magnet weggedrückt zu werden.</w:t>
+      </w:r>
+    </w:p>
+    <w:p>
+      <w:pPr>
+        <w:rPr>
+          <w:lang w:val="de-DE"/>
+        </w:rPr>
+      </w:pPr>
+    </w:p>
+    <w:p>
+      <w:pPr>
+        <w:rPr>
+          <w:lang w:val="de-DE"/>
+        </w:rPr>
+      </w:pPr>
+      <w:r>
+        <w:rPr>
+          <w:lang w:val="de-DE"/>
+        </w:rPr>
         <w:t>https://www.sueddeutsche.de/muenchen/muenchen-schoen-schaurig-1.3322914</w:t>
       </w:r>
     </w:p>
@@ -181,7 +231,14 @@
         <w:rPr>
           <w:lang w:val="de-DE"/>
         </w:rPr>
-        <w:t>Hausmädchen, welche aus dem Brunnen Wasser holen, sind auf mysteriöse Art und Weiße gestorben. Der Weg führt in die Tiefen des Brunnens, wo in den überbauten Ausläufern der Isar und der Kanalisation ein Basilisk haust. Schaut man diesem in die Augen, so stirbt man sofort. Man muss sich die Augen bedecken. Bringt man einen Spiegel, so kann man den Basilisken mit den eigenen Waffen schlagen. So die Legende, denn dieser Trick hat nicht funktioniert und brachte Alexander in Bedrängnis. Friedrich musste ihn und Marina mit der Dienstwaffe retten.</w:t>
+        <w:t xml:space="preserve">Hausmädchen, welche aus dem Brunnen Wasser holen, sind auf mysteriöse Art und Weiße gestorben. Der Weg führt in die Tiefen des Brunnens, wo in den überbauten Ausläufern der Isar und der Kanalisation ein Basilisk haust. Schaut man diesem in die Augen, so stirbt man sofort. Man muss sich die Augen bedecken. Bringt man einen Spiegel, so kann man den Basilisken mit den eigenen Waffen schlagen. So die Legende, denn dieser Trick hat nicht </w:t>
+      </w:r>
+      <w:r>
+        <w:rPr>
+          <w:lang w:val="de-DE"/>
+        </w:rPr>
+        <w:lastRenderedPageBreak/>
+        <w:t>funktioniert und brachte Alexander in Bedrängnis. Friedrich musste ihn und Marina mit der Dienstwaffe retten.</w:t>
       </w:r>
     </w:p>
     <w:p>
@@ -246,21 +303,7 @@
         <w:rPr>
           <w:lang w:val="de-DE"/>
         </w:rPr>
-        <w:t xml:space="preserve">Eine Frau wird der Hexerei bezichtigt. Ein hoher Beamter will sie so aus dem Weg haben, da sie Geheimnisse über ihn weiß. Sie wird im Falkenturm eingesperrt und kann dort per Hexerei entfliehen. Der Beamte beauftragt die </w:t>
-      </w:r>
-      <w:proofErr w:type="spellStart"/>
-      <w:r>
-        <w:rPr>
-          <w:lang w:val="de-DE"/>
-        </w:rPr>
-        <w:t>Custodire</w:t>
-      </w:r>
-      <w:proofErr w:type="spellEnd"/>
-      <w:r>
-        <w:rPr>
-          <w:lang w:val="de-DE"/>
-        </w:rPr>
-        <w:t xml:space="preserve"> die Hexe zu fangen. Sie wird von den Helden gesucht, doch bringt sie den Beamten um und kann später fliehen. Das Trio hat wenig Mitleid mit dem Beamten.</w:t>
+        <w:t>Eine Frau wird der Hexerei bezichtigt. Ein hoher Beamter will sie so aus dem Weg haben, da sie Geheimnisse über ihn weiß. Sie wird im Falkenturm eingesperrt und kann dort per Hexerei entfliehen. Der Beamte beauftragt die Custodire die Hexe zu fangen. Sie wird von den Helden gesucht, doch bringt sie den Beamten um und kann später fliehen. Das Trio hat wenig Mitleid mit dem Beamten.</w:t>
       </w:r>
     </w:p>
     <w:p>
@@ -319,194 +362,70 @@
         <w:rPr>
           <w:lang w:val="de-DE"/>
         </w:rPr>
-        <w:t xml:space="preserve">Anna wird tiefer in das Wesen des Ur-Werwolfs hineingezogen. Sie wird brutaler und blutrünstiger. Und sie zweifelt an den </w:t>
-      </w:r>
-      <w:proofErr w:type="spellStart"/>
-      <w:r>
-        <w:rPr>
-          <w:lang w:val="de-DE"/>
-        </w:rPr>
-        <w:t>Custodire</w:t>
-      </w:r>
-      <w:proofErr w:type="spellEnd"/>
-      <w:r>
-        <w:rPr>
-          <w:lang w:val="de-DE"/>
-        </w:rPr>
-        <w:t xml:space="preserve">, da man ihr in großer Zahl feindselig ist. Nur die Helden, welche ihren Vater ins </w:t>
-      </w:r>
-      <w:proofErr w:type="spellStart"/>
-      <w:r>
-        <w:rPr>
-          <w:lang w:val="de-DE"/>
-        </w:rPr>
-        <w:t>Gefägniss</w:t>
-      </w:r>
-      <w:proofErr w:type="spellEnd"/>
-      <w:r>
-        <w:rPr>
-          <w:lang w:val="de-DE"/>
-        </w:rPr>
-        <w:t xml:space="preserve"> gebracht </w:t>
-      </w:r>
-      <w:proofErr w:type="spellStart"/>
-      <w:r>
-        <w:rPr>
-          <w:lang w:val="de-DE"/>
-        </w:rPr>
-        <w:t>habne</w:t>
-      </w:r>
-      <w:proofErr w:type="spellEnd"/>
-      <w:r>
-        <w:rPr>
-          <w:lang w:val="de-DE"/>
-        </w:rPr>
-        <w:t xml:space="preserve">, und eine </w:t>
-      </w:r>
-      <w:proofErr w:type="spellStart"/>
-      <w:r>
-        <w:rPr>
-          <w:lang w:val="de-DE"/>
-        </w:rPr>
-        <w:t>kleien</w:t>
-      </w:r>
-      <w:proofErr w:type="spellEnd"/>
-      <w:r>
-        <w:rPr>
-          <w:lang w:val="de-DE"/>
-        </w:rPr>
-        <w:t xml:space="preserve"> Zahl von Leuten rund um Helene Berthold halten zu ihr.</w:t>
-      </w:r>
-    </w:p>
-    <w:p>
-      <w:pPr>
-        <w:rPr>
-          <w:lang w:val="de-DE"/>
-        </w:rPr>
-      </w:pPr>
-    </w:p>
-    <w:p>
-      <w:pPr>
-        <w:rPr>
-          <w:lang w:val="de-DE"/>
-        </w:rPr>
-      </w:pPr>
-      <w:r>
-        <w:rPr>
-          <w:lang w:val="de-DE"/>
-        </w:rPr>
-        <w:t xml:space="preserve">Josef, August, und von </w:t>
-      </w:r>
-      <w:proofErr w:type="spellStart"/>
-      <w:r>
-        <w:rPr>
-          <w:lang w:val="de-DE"/>
-        </w:rPr>
-        <w:t>Ingenheim</w:t>
-      </w:r>
-      <w:proofErr w:type="spellEnd"/>
-      <w:r>
-        <w:rPr>
-          <w:lang w:val="de-DE"/>
-        </w:rPr>
-        <w:t xml:space="preserve"> übernehmen mehr und mehr Aufträge des </w:t>
-      </w:r>
-      <w:proofErr w:type="spellStart"/>
-      <w:r>
-        <w:rPr>
-          <w:lang w:val="de-DE"/>
-        </w:rPr>
-        <w:t>kults</w:t>
-      </w:r>
-      <w:proofErr w:type="spellEnd"/>
-      <w:r>
-        <w:rPr>
-          <w:lang w:val="de-DE"/>
-        </w:rPr>
-        <w:t xml:space="preserve">. Josef ist neutral eingestellt, von </w:t>
-      </w:r>
-      <w:proofErr w:type="spellStart"/>
-      <w:r>
-        <w:rPr>
-          <w:lang w:val="de-DE"/>
-        </w:rPr>
-        <w:t>INgeenheim</w:t>
-      </w:r>
-      <w:proofErr w:type="spellEnd"/>
-      <w:r>
-        <w:rPr>
-          <w:lang w:val="de-DE"/>
-        </w:rPr>
-        <w:t xml:space="preserve"> möchte fliehen und August geht im Kult komplett auf </w:t>
-      </w:r>
-      <w:proofErr w:type="spellStart"/>
-      <w:r>
-        <w:rPr>
-          <w:lang w:val="de-DE"/>
-        </w:rPr>
-        <w:t>unid</w:t>
-      </w:r>
-      <w:proofErr w:type="spellEnd"/>
-      <w:r>
-        <w:rPr>
-          <w:lang w:val="de-DE"/>
-        </w:rPr>
-        <w:t xml:space="preserve"> wird wahrlich gläubig.</w:t>
-      </w:r>
-    </w:p>
-    <w:p>
-      <w:pPr>
-        <w:rPr>
-          <w:lang w:val="de-DE"/>
-        </w:rPr>
-      </w:pPr>
-      <w:r>
-        <w:rPr>
-          <w:lang w:val="de-DE"/>
-        </w:rPr>
-        <w:t xml:space="preserve">August wird darauf angesetzt die Wardens zu infiltrieren. Sie stellen einen </w:t>
-      </w:r>
-      <w:proofErr w:type="spellStart"/>
-      <w:r>
-        <w:rPr>
-          <w:lang w:val="de-DE"/>
-        </w:rPr>
-        <w:t>Mosnterangriff</w:t>
-      </w:r>
-      <w:proofErr w:type="spellEnd"/>
-      <w:r>
-        <w:rPr>
-          <w:lang w:val="de-DE"/>
-        </w:rPr>
-        <w:t xml:space="preserve"> nach, wobei er möglichst </w:t>
-      </w:r>
-      <w:proofErr w:type="spellStart"/>
-      <w:r>
-        <w:rPr>
-          <w:lang w:val="de-DE"/>
-        </w:rPr>
-        <w:t>glubwürdig</w:t>
-      </w:r>
-      <w:proofErr w:type="spellEnd"/>
-      <w:r>
-        <w:rPr>
-          <w:lang w:val="de-DE"/>
-        </w:rPr>
-        <w:t xml:space="preserve"> sich und andere rettet. Die Wardens nehmen wirklich jeden auf den sie kriegen können. Er tritt heimlich den </w:t>
-      </w:r>
-      <w:proofErr w:type="spellStart"/>
-      <w:r>
-        <w:rPr>
-          <w:lang w:val="de-DE"/>
-        </w:rPr>
-        <w:t>Custodire</w:t>
-      </w:r>
-      <w:proofErr w:type="spellEnd"/>
-      <w:r>
-        <w:rPr>
-          <w:lang w:val="de-DE"/>
-        </w:rPr>
-        <w:t xml:space="preserve"> bei, Anna ist stutzig.</w:t>
+        <w:t>Anna wird tiefer in das Wesen des Ur-Werwolfs hineingezogen. Sie wird brutaler und blutrünstiger. Und sie zweifelt an den Custodire, da man ihr in großer Zahl feindselig ist. Nur die Helden, welche ihren Vater ins Gefägniss gebracht habne, und eine kleien Zahl von Leuten rund um Helene Berthold halten zu ihr.</w:t>
+      </w:r>
+    </w:p>
+    <w:p>
+      <w:pPr>
+        <w:rPr>
+          <w:lang w:val="de-DE"/>
+        </w:rPr>
+      </w:pPr>
+    </w:p>
+    <w:p>
+      <w:pPr>
+        <w:rPr>
+          <w:lang w:val="de-DE"/>
+        </w:rPr>
+      </w:pPr>
+      <w:r>
+        <w:rPr>
+          <w:lang w:val="de-DE"/>
+        </w:rPr>
+        <w:t>Josef, August, und von Ingenheim übernehmen mehr und mehr Aufträge des kults. Josef ist neutral eingestellt, von Igenheim möchte fliehen und August geht im Kult komplett auf und wird wahrlich gläubig.</w:t>
+      </w:r>
+      <w:r>
+        <w:rPr>
+          <w:lang w:val="de-DE"/>
+        </w:rPr>
+        <w:t xml:space="preserve"> Sie brechen Erik Siebert aus.</w:t>
+      </w:r>
+    </w:p>
+    <w:p>
+      <w:pPr>
+        <w:rPr>
+          <w:lang w:val="de-DE"/>
+        </w:rPr>
+      </w:pPr>
+      <w:r>
+        <w:rPr>
+          <w:lang w:val="de-DE"/>
+        </w:rPr>
+        <w:t>August wird darauf angesetzt die Wardens zu infiltrieren. Sie stellen einen Mon</w:t>
+      </w:r>
+      <w:r>
+        <w:rPr>
+          <w:lang w:val="de-DE"/>
+        </w:rPr>
+        <w:t>s</w:t>
+      </w:r>
+      <w:r>
+        <w:rPr>
+          <w:lang w:val="de-DE"/>
+        </w:rPr>
+        <w:t>terangriff nach, wobei er möglichst gl</w:t>
+      </w:r>
+      <w:r>
+        <w:rPr>
+          <w:lang w:val="de-DE"/>
+        </w:rPr>
+        <w:t>a</w:t>
+      </w:r>
+      <w:r>
+        <w:rPr>
+          <w:lang w:val="de-DE"/>
+        </w:rPr>
+        <w:t>ubwürdig sich und andere rettet. Die Wardens nehmen wirklich jeden auf den sie kriegen können. Er tritt heimlich den Custodire bei, Anna ist stutzig.</w:t>
       </w:r>
     </w:p>
     <w:p>
@@ -553,49 +472,47 @@
         <w:rPr>
           <w:lang w:val="de-DE"/>
         </w:rPr>
+        <w:t>Das Trio wird gefangen genommen von Dämonen und die Seele des Jungfernturms bietet an sich opfern zu lassen. Alexander sagt, er will seine Seele opfern um due anderen zu retten, doch die Dämonen wissen von den Tricks, sie denken, dass er wirklich s8eine eigene Seele opfert, da „gewaltsam“ aufgenommene Seele nicht zu einem gehören. Doch die Seele des Jungfernturms ist wahrlich eine Seele von Alexander und kann geopfert werden. Das Trio wird so befreit und bezwingt die Dämonen, leider wurde die Seele aus dem Jungfernturm dabei zerstört.</w:t>
+      </w:r>
+      <w:r>
+        <w:rPr>
+          <w:lang w:val="de-DE"/>
+        </w:rPr>
+        <w:t xml:space="preserve"> Alexander kehrt zum Turm zurück, um alle Seelen dort aufzunehmen, obwohl er weiß, dass es gefährlich ist.</w:t>
+      </w:r>
+    </w:p>
+    <w:p>
+      <w:pPr>
+        <w:rPr>
+          <w:lang w:val="de-DE"/>
+        </w:rPr>
+      </w:pPr>
+    </w:p>
+    <w:p>
+      <w:r>
+        <w:rPr>
+          <w:lang w:val="de-DE"/>
+        </w:rPr>
+        <w:tab/>
+      </w:r>
+      <w:r>
+        <w:t>After their abduction and the subsequent destruction of the first soul he had carried Alexander had hid inside his room for three days straight. He had thought to let this one poor soul escape their so far eternal torment, to let them roam with him outside of their cage made of bricks and wood. But what had she done, rescuing him and the others, the cost her own life. And he was suffering for it.</w:t>
+      </w:r>
+      <w:r>
+        <w:t xml:space="preserve"> How he again was powerless to stop the cruelty. How he was part of the killing the man he had admired so much, the Count Alois Großberg, that had helped him to achieve something for himself, even if he was not sure if he could even do one thing right. He had persuaded his Professor to take a huge part in the project to build the cable car up the mountain at Lenggries. For he saw what Alexander could do.</w:t>
+      </w:r>
+    </w:p>
+    <w:p/>
+    <w:p>
+      <w:pPr>
+        <w:ind w:firstLine="708"/>
+      </w:pPr>
+      <w:r>
+        <w:t xml:space="preserve">His tears had dried some while ago, a faint crust of salt clinging to his cheeks. He had no one told about what he had endured, only kept it to himself. Had never spoken about the death of his brother, not to the police or even his grandparents. One time he had heard them talk about that matter, how they thought that it had been his fault, else he would have spoken to them, even just a few words. That had crushed him and he had locked himself away further and further. Told no one about how he was bullied at school, how he had been </w:t>
+      </w:r>
+      <w:r>
         <w:lastRenderedPageBreak/>
-        <w:t>Das Trio wird gefangen genommen von Dämonen und die Seele des Jungfernturms bietet an sich opfern zu lassen. Alexander sagt, er will seine Seele opfern um due anderen zu retten, doch die Dämonen wissen von den Tricks, sie denken, dass er wirklich s8eine eigene Seele opfert, da „gewaltsam“ aufgenommene Seele nicht zu einem gehören. Doch die Seele des Jungfernturms ist wahrlich eine Seele von Alexander und kann geopfert werden. Das Trio wird so befreit und bezwingt die Dämonen, leider wurde die Seele aus dem Jungfernturm dabei zerstört.</w:t>
-      </w:r>
-      <w:r>
-        <w:rPr>
-          <w:lang w:val="de-DE"/>
-        </w:rPr>
-        <w:t xml:space="preserve"> Alexander kehrt zum Turm zurück, um alle Seelen dort aufzunehmen, obwohl er weiß, dass es gefährlich ist.</w:t>
-      </w:r>
-    </w:p>
-    <w:p>
-      <w:pPr>
-        <w:rPr>
-          <w:lang w:val="de-DE"/>
-        </w:rPr>
-      </w:pPr>
-    </w:p>
-    <w:p>
-      <w:r>
-        <w:rPr>
-          <w:lang w:val="de-DE"/>
-        </w:rPr>
-        <w:tab/>
-      </w:r>
-      <w:r>
-        <w:t>After their abduction and the subsequent destruction of the first soul he had carried Alexander had hid inside his room for three days straight. He had thought to let this one poor soul escape their so far eternal torment, to let them roam with him outside of their cage made of bricks and wood. But what had she done, rescuing him and the others, the cost her own life. And he was suffering for it.</w:t>
-      </w:r>
-      <w:r>
-        <w:t xml:space="preserve"> How he again was powerless to stop the cruelty. How he was part of the killing the man he had admired so much, the Count Alois Großberg, that had helped him to achieve something for himself, even if he was not sure if he could even do one thing right. He had persuaded his Professor to take a huge part in the project to build the cable car up the mountain at </w:t>
-      </w:r>
-      <w:proofErr w:type="spellStart"/>
-      <w:r>
-        <w:t>Lenggries</w:t>
-      </w:r>
-      <w:proofErr w:type="spellEnd"/>
-      <w:r>
-        <w:t>. For he saw what Alexander could do.</w:t>
-      </w:r>
-    </w:p>
-    <w:p/>
-    <w:p>
-      <w:r>
-        <w:t>His tears had dried some while ago, a faint crust of salt clinging to his cheeks. He had no one told about what he had endured, only kept it to himself. Had never spoken about the death of his brother, not to the police or even his grandparents. One time he had heard them talk about that matter, how they thought that it had been his fault, else he would have spoken to them, even just a few words. That had crushed him and he had locked himself away further and further. Told no one about how he was bullied at school, how he had been forgotten at his own graduation ceremony. How he had slogged through mounts of books just to get accepted to university, no connections helping him but only hindering. Though, in comparison to her he had endured nothing at all. So, should he be happy about what has happened to him so far? That it could be so much worse?</w:t>
+        <w:t>forgotten at his own graduation ceremony. How he had slogged through mounts of books just to get accepted to university, no connections helping him but only hindering. Though, in comparison to her he had endured nothing at all. So, should he be happy about what has happened to him so far? That it could be so much worse?</w:t>
       </w:r>
     </w:p>
     <w:p>
@@ -633,7 +550,6 @@
     </w:p>
     <w:p>
       <w:r>
-        <w:lastRenderedPageBreak/>
         <w:tab/>
         <w:t>That were the words of Michael Reichelt, the man that always smiled, come hell or death.</w:t>
       </w:r>
@@ -651,6 +567,9 @@
       </w:r>
     </w:p>
     <w:p>
+      <w:pPr>
+        <w:ind w:firstLine="708"/>
+      </w:pPr>
       <w:r>
         <w:t>“</w:t>
       </w:r>
@@ -698,6 +617,9 @@
       </w:r>
     </w:p>
     <w:p>
+      <w:pPr>
+        <w:ind w:firstLine="708"/>
+      </w:pPr>
       <w:r>
         <w:t xml:space="preserve">Feeling like he had just solved an impossible formula Alexander sprang up from the bed, and scribbled down his thoughts, just to let them escape to the world. To hell if someone would read them, those are just proof that he thought about them himself. That he, Alexander Doppler, was loving himself. That no one could take that from him, for he was the only one that could. And the only one that could give it in the same matter. He set the pen aside, it sliding down the edge of the desk, but no matter. He threw </w:t>
       </w:r>
@@ -706,6 +628,9 @@
       </w:r>
     </w:p>
     <w:p>
+      <w:pPr>
+        <w:ind w:firstLine="708"/>
+      </w:pPr>
       <w:r>
         <w:t xml:space="preserve">Alexander </w:t>
       </w:r>
@@ -713,15 +638,11 @@
         <w:t xml:space="preserve">then </w:t>
       </w:r>
       <w:r>
-        <w:t xml:space="preserve">went to the </w:t>
-      </w:r>
-      <w:proofErr w:type="spellStart"/>
-      <w:r>
-        <w:t>Jungfernturm</w:t>
-      </w:r>
-      <w:proofErr w:type="spellEnd"/>
-      <w:r>
-        <w:t xml:space="preserve">, back to the place where the stories had told that there had been killed dozens of women. He went down the few steps into the shallow and sad down, sensing the presence of more than just the soul of her that they had found, that was haunting people so far that they had almost killed themselves. There he just listened to their wails, their hurt they had suffered in their last days on earth and the gruesome death they had been delt to. Ending up like these tormented souls. He did not react to them in anger, nor did he cry or flee. He just listened. </w:t>
+        <w:t xml:space="preserve">went to the Jungfernturm, back to the place where the stories had told that there had been killed dozens of women. He went down the few steps into the shallow and sad down, sensing the presence of more than just the soul of her that they had </w:t>
+      </w:r>
+      <w:r>
+        <w:lastRenderedPageBreak/>
+        <w:t xml:space="preserve">found, that was haunting people so far that they had almost killed themselves. There he just listened to their wails, their hurt they had suffered in their last days on earth and the gruesome death they had been delt to. Ending up like these tormented souls. He did not react to them in anger, nor did he cry or flee. He just listened. </w:t>
       </w:r>
       <w:r>
         <w:t>They</w:t>
@@ -734,23 +655,14 @@
       </w:r>
     </w:p>
     <w:p>
-      <w:r>
-        <w:t xml:space="preserve">They would not find a way out of this misery themselves, their mind gone long ago and souls filled to the brim with their last experiences on earth. That is why he would carry them away from this tower if they let him, listen to their stories hidden in the lines of their suffering. He knew he could carry himself now, so he would do the same for someone else. One after the other they found a new home within </w:t>
-      </w:r>
-      <w:proofErr w:type="spellStart"/>
-      <w:r>
-        <w:t>is</w:t>
-      </w:r>
-      <w:proofErr w:type="spellEnd"/>
-      <w:r>
-        <w:t xml:space="preserve"> own soul, an open ground for them to rest. So long until they would be ready to go on themselves, find their way to the afterlife they should have been a part of.</w:t>
-      </w:r>
-      <w:r>
-        <w:t xml:space="preserve"> A stream of white contours gathered around him, smoke he could faintly see. In the end seven of them chose to stay with him, other too hard to see, their souls gone </w:t>
-      </w:r>
-      <w:r>
-        <w:lastRenderedPageBreak/>
-        <w:t>too far, their pain too great, their life to far away. But he was able to help these seven.</w:t>
+      <w:pPr>
+        <w:ind w:firstLine="708"/>
+      </w:pPr>
+      <w:r>
+        <w:t>They would not find a way out of this misery themselves, their mind gone long ago and souls filled to the brim with their last experiences on earth. That is why he would carry them away from this tower if they let him, listen to their stories hidden in the lines of their suffering. He knew he could carry himself now, so he would do the same for someone else. One after the other they found a new home within is own soul, an open ground for them to rest. So long until they would be ready to go on themselves, find their way to the afterlife they should have been a part of.</w:t>
+      </w:r>
+      <w:r>
+        <w:t xml:space="preserve"> A stream of white contours gathered around him, smoke he could faintly see. In the end seven of them chose to stay with him, other too hard to see, their souls gone too far, their pain too great, their life to far away. But he was able to help these seven.</w:t>
       </w:r>
       <w:r>
         <w:t xml:space="preserve"> </w:t>
@@ -759,13 +671,7 @@
         <w:t>And he would never ask a thing of them.</w:t>
       </w:r>
     </w:p>
-    <w:p>
-      <w:pPr>
-        <w:rPr>
-          <w:lang w:val="de-DE"/>
-        </w:rPr>
-      </w:pPr>
-    </w:p>
+    <w:p/>
     <w:p>
       <w:pPr>
         <w:rPr>
@@ -877,68 +783,100 @@
           <w:lang w:val="de-DE"/>
         </w:rPr>
       </w:pPr>
-    </w:p>
-    <w:p>
-      <w:pPr>
-        <w:rPr>
-          <w:lang w:val="de-DE"/>
-        </w:rPr>
-      </w:pPr>
-    </w:p>
-    <w:p>
-      <w:pPr>
-        <w:rPr>
-          <w:lang w:val="de-DE"/>
-        </w:rPr>
-      </w:pPr>
-      <w:proofErr w:type="spellStart"/>
-      <w:r>
-        <w:rPr>
-          <w:lang w:val="de-DE"/>
-        </w:rPr>
-        <w:t>Sidestory</w:t>
-      </w:r>
-      <w:proofErr w:type="spellEnd"/>
-      <w:r>
-        <w:rPr>
-          <w:lang w:val="de-DE"/>
-        </w:rPr>
-        <w:t>:</w:t>
-      </w:r>
-    </w:p>
-    <w:p>
-      <w:pPr>
-        <w:rPr>
-          <w:lang w:val="de-DE"/>
-        </w:rPr>
-      </w:pPr>
-      <w:proofErr w:type="spellStart"/>
-      <w:r>
-        <w:rPr>
-          <w:lang w:val="de-DE"/>
-        </w:rPr>
-        <w:t>Taa</w:t>
-      </w:r>
-      <w:proofErr w:type="spellEnd"/>
-      <w:r>
-        <w:rPr>
-          <w:lang w:val="de-DE"/>
-        </w:rPr>
-        <w:t xml:space="preserve"> </w:t>
-      </w:r>
-      <w:proofErr w:type="spellStart"/>
-      <w:r>
-        <w:rPr>
-          <w:lang w:val="de-DE"/>
-        </w:rPr>
-        <w:t>Vo</w:t>
-      </w:r>
-      <w:proofErr w:type="spellEnd"/>
-      <w:r>
-        <w:rPr>
-          <w:lang w:val="de-DE"/>
-        </w:rPr>
-        <w:t xml:space="preserve"> wird als ehrenwerter Dämon Gast einer Familie und lernt wie es ist ein Mensch zu sein. Die Tochter der Familie hat Kaninchen und er lernt den vorsichtigen Umgang mit diesen. Am Ende wird er von anderen Dämonen besucht und lernt über deren Pläne.</w:t>
+      <w:r>
+        <w:rPr>
+          <w:lang w:val="de-DE"/>
+        </w:rPr>
+        <w:t xml:space="preserve"> Kapitel:</w:t>
+      </w:r>
+    </w:p>
+    <w:p>
+      <w:pPr>
+        <w:rPr>
+          <w:lang w:val="de-DE"/>
+        </w:rPr>
+      </w:pPr>
+      <w:r>
+        <w:rPr>
+          <w:lang w:val="de-DE"/>
+        </w:rPr>
+        <w:t>Alexander hat nun mehr Selbstvertrauen.</w:t>
+      </w:r>
+    </w:p>
+    <w:p>
+      <w:pPr>
+        <w:rPr>
+          <w:lang w:val="de-DE"/>
+        </w:rPr>
+      </w:pPr>
+      <w:r>
+        <w:rPr>
+          <w:lang w:val="de-DE"/>
+        </w:rPr>
+        <w:t>Alexander trägt den Wardens vor, was er denkt was die Sätze bedeuten, die Wiederkehr von Dingen, der Totsünden, es gab bisher sechs aufgezeichnete Erscheinungen, aber was wenn vor Aufzeichnungen schon etwas geschehen ist. Was wenn sie schon bei Nummer 7 oder 8 sind? Und nicht 6.</w:t>
+      </w:r>
+      <w:r>
+        <w:rPr>
+          <w:lang w:val="de-DE"/>
+        </w:rPr>
+        <w:t xml:space="preserve"> Mann traut ihm nun mehr und </w:t>
+      </w:r>
+      <w:r>
+        <w:rPr>
+          <w:lang w:val="de-DE"/>
+        </w:rPr>
+        <w:t>lässt</w:t>
+      </w:r>
+      <w:r>
+        <w:rPr>
+          <w:lang w:val="de-DE"/>
+        </w:rPr>
+        <w:t xml:space="preserve"> ihn weiter forschen. Doch er will kein Nervar mehr sein, sondern D</w:t>
+      </w:r>
+      <w:r>
+        <w:rPr>
+          <w:lang w:val="de-DE"/>
+        </w:rPr>
+        <w:t>i</w:t>
+      </w:r>
+      <w:r>
+        <w:rPr>
+          <w:lang w:val="de-DE"/>
+        </w:rPr>
+        <w:t>anist bleiben.</w:t>
+      </w:r>
+    </w:p>
+    <w:p>
+      <w:pPr>
+        <w:rPr>
+          <w:lang w:val="de-DE"/>
+        </w:rPr>
+      </w:pPr>
+    </w:p>
+    <w:p>
+      <w:pPr>
+        <w:rPr>
+          <w:lang w:val="de-DE"/>
+        </w:rPr>
+      </w:pPr>
+      <w:r>
+        <w:rPr>
+          <w:lang w:val="de-DE"/>
+        </w:rPr>
+        <w:t>Sidestory:</w:t>
+      </w:r>
+    </w:p>
+    <w:p>
+      <w:pPr>
+        <w:rPr>
+          <w:lang w:val="de-DE"/>
+        </w:rPr>
+      </w:pPr>
+      <w:r>
+        <w:rPr>
+          <w:lang w:val="de-DE"/>
+        </w:rPr>
+        <w:t>Taa Vo wird als ehrenwerter Dämon Gast einer Familie und lernt wie es ist ein Mensch zu sein. Die Tochter der Familie hat Kaninchen und er lernt den vorsichtigen Umgang mit diesen. Am Ende wird er von anderen Dämonen besucht und lernt über deren Pläne.</w:t>
       </w:r>
     </w:p>
     <w:sectPr>

</xml_diff>